<commit_message>
Regenerate all 60 DOCX and 3 PDF files with PECH brand page borders
DOCX files now have native Word page borders using PECH brand colors:
- Top border: Sky Blue (#00BFFF)
- Left border: Dark Blue (#0099CC)
- Bottom border: Orange (#F5A623)
- Right border: Dark Orange (#E08A00)

PDF files regenerated from updated Markdown with CSS ribbon styling
applied via proposal_style.css.

https://claude.ai/code/session_014AKpynNrHyqLfWAM6MLBvL
</commit_message>
<xml_diff>
--- a/PECH_GROUP_FINANCIAL_PROPOSAL_250M_NAIRA.docx
+++ b/PECH_GROUP_FINANCIAL_PROPOSAL_250M_NAIRA.docx
@@ -30556,7 +30556,14 @@
     <w:bookmarkEnd w:id="149"/>
     <w:bookmarkEnd w:id="150"/>
     <w:bookmarkEnd w:id="151"/>
-    <w:sectPr/>
+    <w:sectPr>
+      <w:pgBorders w:offsetFrom="page">
+        <w:top w:val="single" w:sz="18" w:space="24" w:color="00BFFF"/>
+        <w:left w:val="single" w:sz="18" w:space="24" w:color="0099CC"/>
+        <w:bottom w:val="single" w:sz="18" w:space="24" w:color="F5A623"/>
+        <w:right w:val="single" w:sz="18" w:space="24" w:color="E08A00"/>
+      </w:pgBorders>
+    </w:sectPr>
   </w:body>
 </w:document>
 </file>

</xml_diff>